<commit_message>
docs: add routine-message summaries to semanarios
</commit_message>
<xml_diff>
--- a/docs/semanarios/2026-09/semanario-rafael-martins-2026-09-07-a-11-semana-b.docx
+++ b/docs/semanarios/2026-09/semanario-rafael-martins-2026-09-07-a-11-semana-b.docx
@@ -977,6 +977,20 @@
     <w:bookmarkStart w:id="13" w:name="ºc-1009-12551435"/>
     <w:p>
       <w:pPr>
+        <w:pStyle w:val="Heading4"/>
+      </w:pPr>
+      <w:r>
+        <w:t>Resumo do Encontro</w:t>
+      </w:r>
+    </w:p>
+    <w:p>
+      <w:pPr/>
+      <w:r>
+        <w:t>Mensagem de rotina para as famílias: Hoje a turma explorou as cores presentes na natureza e na arte. As crianças observaram referências, conversaram sobre combinações e contrastes e fizeram escolhas de cor em suas criações. Ao compartilhar as produções, puderam explicar suas ideias e valorizar diferentes formas de olhar para o mundo.</w:t>
+      </w:r>
+    </w:p>
+    <w:p>
+      <w:pPr>
         <w:pStyle w:val="Heading3"/>
       </w:pPr>
       <w:r>
@@ -1223,6 +1237,20 @@
     <w:bookmarkStart w:id="14" w:name="ºc-1009-15451725"/>
     <w:p>
       <w:pPr>
+        <w:pStyle w:val="Heading4"/>
+      </w:pPr>
+      <w:r>
+        <w:t>Resumo do Encontro</w:t>
+      </w:r>
+    </w:p>
+    <w:p>
+      <w:pPr/>
+      <w:r>
+        <w:t>Mensagem de rotina para as famílias: Hoje a turma participou de desafios de medição, escolhendo instrumentos adequados para cada situação. As crianças compararam resultados, testaram estratégias e explicaram aos colegas por que cada escolha fazia sentido. A proposta fortaleceu a observação, o raciocínio matemático e a comunicação das descobertas.</w:t>
+      </w:r>
+    </w:p>
+    <w:p>
+      <w:pPr>
         <w:pStyle w:val="Heading3"/>
       </w:pPr>
       <w:r>
@@ -1453,6 +1481,20 @@
     <w:bookmarkStart w:id="15" w:name="ºa-1109-07150855"/>
     <w:p>
       <w:pPr>
+        <w:pStyle w:val="Heading4"/>
+      </w:pPr>
+      <w:r>
+        <w:t>Resumo do Encontro</w:t>
+      </w:r>
+    </w:p>
+    <w:p>
+      <w:pPr/>
+      <w:r>
+        <w:t>Mensagem de rotina para as famílias: Hoje a turma programou o Matata para participar de um desafio de futebol. As crianças pensaram nos movimentos necessários, criaram trajetos, testaram os comandos e ajustaram as sequências para alcançar o objetivo do jogo. A atividade estimulou planejamento, raciocínio lógico e cooperação entre os colegas.</w:t>
+      </w:r>
+    </w:p>
+    <w:p>
+      <w:pPr>
         <w:pStyle w:val="Heading3"/>
       </w:pPr>
       <w:r>
@@ -1486,6 +1528,20 @@
     <w:bookmarkEnd w:id="15"/>
     <w:bookmarkEnd w:id="16"/>
     <w:bookmarkStart w:id="17" w:name="registro-pós-aula"/>
+    <w:p>
+      <w:pPr>
+        <w:pStyle w:val="Heading4"/>
+      </w:pPr>
+      <w:r>
+        <w:t>Resumo do Encontro</w:t>
+      </w:r>
+    </w:p>
+    <w:p>
+      <w:pPr/>
+      <w:r>
+        <w:t>Mensagem de rotina para as famílias: Hoje a turma explorou as cores presentes na natureza e na arte. As crianças observaram referências, conversaram sobre combinações e contrastes e fizeram escolhas de cor em suas criações. Ao compartilhar as produções, puderam explicar suas ideias e valorizar diferentes formas de olhar para o mundo.</w:t>
+      </w:r>
+    </w:p>
     <w:p>
       <w:pPr>
         <w:pStyle w:val="Heading2"/>

</xml_diff>